<commit_message>
fix: muestra el logo en favicon y vistas previas de WhatsApp
</commit_message>
<xml_diff>
--- a/docs/Arquitectura_Marcbook_Cosmos.docx
+++ b/docs/Arquitectura_Marcbook_Cosmos.docx
@@ -2373,7 +2373,7 @@
                 <w:color w:val="193958"/>
                 <w:sz w:val="21"/>
               </w:rPr>
-              <w:t>public/favicon.svg</w:t>
+              <w:t>public/favicon.ico y favicon-96.png</w:t>
             </w:r>
           </w:p>
         </w:tc>
@@ -2391,7 +2391,83 @@
                 <w:color w:val="193958"/>
                 <w:sz w:val="21"/>
               </w:rPr>
-              <w:t>Icono con la versión apilada oficial; generado por scripts/build-favicon.mjs.</w:t>
+              <w:t>Iconos raster del navegador; ICO con cinco resoluciones y PNG de 96 px.</w:t>
+            </w:r>
+          </w:p>
+        </w:tc>
+      </w:tr>
+      <w:tr>
+        <w:tc>
+          <w:tcPr>
+            <w:tcW w:w="3400" w:type="dxa"/>
+            <w:shd w:fill="F0F5FC"/>
+          </w:tcPr>
+          <w:p>
+            <w:pPr>
+              <w:spacing w:after="0"/>
+            </w:pPr>
+            <w:r>
+              <w:rPr>
+                <w:color w:val="193958"/>
+                <w:sz w:val="21"/>
+              </w:rPr>
+              <w:t>public/apple-touch-icon.png</w:t>
+            </w:r>
+          </w:p>
+        </w:tc>
+        <w:tc>
+          <w:tcPr>
+            <w:tcW w:w="6200" w:type="dxa"/>
+            <w:shd w:fill="F0F5FC"/>
+          </w:tcPr>
+          <w:p>
+            <w:pPr>
+              <w:spacing w:after="0"/>
+            </w:pPr>
+            <w:r>
+              <w:rPr>
+                <w:color w:val="193958"/>
+                <w:sz w:val="21"/>
+              </w:rPr>
+              <w:t>Icono de 180 px para dispositivos Apple.</w:t>
+            </w:r>
+          </w:p>
+        </w:tc>
+      </w:tr>
+      <w:tr>
+        <w:tc>
+          <w:tcPr>
+            <w:tcW w:w="3400" w:type="dxa"/>
+            <w:shd w:fill="FFFFFF"/>
+          </w:tcPr>
+          <w:p>
+            <w:pPr>
+              <w:spacing w:after="0"/>
+            </w:pPr>
+            <w:r>
+              <w:rPr>
+                <w:color w:val="193958"/>
+                <w:sz w:val="21"/>
+              </w:rPr>
+              <w:t>public/social/marcbook-share.png</w:t>
+            </w:r>
+          </w:p>
+        </w:tc>
+        <w:tc>
+          <w:tcPr>
+            <w:tcW w:w="6200" w:type="dxa"/>
+            <w:shd w:fill="FFFFFF"/>
+          </w:tcPr>
+          <w:p>
+            <w:pPr>
+              <w:spacing w:after="0"/>
+            </w:pPr>
+            <w:r>
+              <w:rPr>
+                <w:color w:val="193958"/>
+                <w:sz w:val="21"/>
+              </w:rPr>
+              <w:t>Tarjeta de 1200×630 con el logo para Open Graph y vistas previas.</w:t>
             </w:r>
           </w:p>
         </w:tc>
@@ -3971,6 +4047,11 @@
       </w:r>
     </w:p>
     <w:p>
+      <w:r>
+        <w:t xml:space="preserve">Los iconos de pestaña se sirven como ICO y PNG reales. La tarjeta social usa el logo apilado sobre fondo oscuro en un PNG de 1200×630, con metadatos HTTPS, MIME y dimensiones. scripts/build-favicon.mjs genera los derivados mediante scripts/lib/png.mjs, sin modificar los logos originales. El SVG anterior deja de ser el icono anunciado en el HTML.</w:t>
+      </w:r>
+    </w:p>
+    <w:p>
       <w:pPr>
         <w:pStyle w:val="Heading2"/>
       </w:pPr>
@@ -4313,7 +4394,7 @@
                 <w:color w:val="193958"/>
                 <w:sz w:val="21"/>
               </w:rPr>
-              <w:t>Regenera public/favicon.svg desde el PNG oficial apilado.</w:t>
+              <w:t>Regenera iconos ICO/PNG, icono Apple y tarjeta social desde el logo oficial.</w:t>
             </w:r>
           </w:p>
         </w:tc>

</xml_diff>